<commit_message>
Fix: Corregir errores críticos en Problemattic-PISA-02-t1.Rmd
- Implementar selección aleatoria real del producto (producto_index)
- Corregir cálculo de xol usando índice dinámico en lugar de hardcodeado
- Sincronizar explode del gráfico circular con producto seleccionado
- Estandarizar nombres de variables (producto_seleccionado)
- Agregar validaciones de coherencia año-valor
- Implementar verificación de unicidad en opciones de respuesta
- Actualizar todas las referencias en pregunta y solución

Resuelve problema donde siempre se calculaba el 5to producto independientemente
del producto realmente seleccionado para la pregunta.
</commit_message>
<xml_diff>
--- a/06-Estadística-Y-Probabilidad/Pensamiento-Aleatorio/01-Variables-Cualitativas_Distribucion-De-Frecuencias/Pasteleria_sabores_ventas_estadistica_interpretacion_representacion_n2_v1/salida/pasteleria_sabores_ventas_estadistica_interpretacion_representacion_n2_v1_1.docx
+++ b/06-Estadística-Y-Probabilidad/Pensamiento-Aleatorio/01-Variables-Cualitativas_Distribucion-De-Frecuencias/Pasteleria_sabores_ventas_estadistica_interpretacion_representacion_n2_v1/salida/pasteleria_sabores_ventas_estadistica_interpretacion_representacion_n2_v1_1.docx
@@ -150,7 +150,7 @@
       <w:r>
         <w:drawing>
           <wp:inline>
-            <wp:extent cx="2879999" cy="1032369"/>
+            <wp:extent cx="2879999" cy="1089969"/>
             <wp:effectExtent b="0" l="0" r="0" t="0"/>
             <wp:docPr descr="image" title="" id="21" name="Picture"/>
             <a:graphic>
@@ -171,7 +171,7 @@
                   <pic:spPr bwMode="auto">
                     <a:xfrm>
                       <a:off x="0" y="0"/>
-                      <a:ext cx="2879999" cy="1032369"/>
+                      <a:ext cx="2879999" cy="1089969"/>
                     </a:xfrm>
                     <a:prstGeom prst="rect">
                       <a:avLst/>
@@ -285,7 +285,7 @@
         </w:numPr>
       </w:pPr>
       <w:r>
-        <w:t xml:space="preserve">Se venderán el domingo y los sabores serán durazno y manzana.</w:t>
+        <w:t xml:space="preserve">Se venderán el sábado y los sabores serán cereza y piña.</w:t>
       </w:r>
     </w:p>
     <w:p>
@@ -296,7 +296,7 @@
         </w:numPr>
       </w:pPr>
       <w:r>
-        <w:t xml:space="preserve">El día viernes se ofrecerán sabores durazno y manzana.</w:t>
+        <w:t xml:space="preserve">La promoción será el lunes con tortas de uva y piña.</w:t>
       </w:r>
     </w:p>
     <w:p>
@@ -307,7 +307,7 @@
         </w:numPr>
       </w:pPr>
       <w:r>
-        <w:t xml:space="preserve">La promoción será el viernes con tortas de maracuyá y manzana.</w:t>
+        <w:t xml:space="preserve">El día lunes se ofrecerán sabores cereza y piña.</w:t>
       </w:r>
     </w:p>
     <w:p>
@@ -318,7 +318,7 @@
         </w:numPr>
       </w:pPr>
       <w:r>
-        <w:t xml:space="preserve">El día miércoles se ofrecerán sabores durazno y manzana.</w:t>
+        <w:t xml:space="preserve">Se venderán el lunes y los sabores serán banano y uva.</w:t>
       </w:r>
     </w:p>
     <w:p>
@@ -407,7 +407,7 @@
         </w:numPr>
       </w:pPr>
       <w:r>
-        <w:t xml:space="preserve">Durazno : 177 clientes</w:t>
+        <w:t xml:space="preserve">Cereza : 197 clientes</w:t>
       </w:r>
     </w:p>
     <w:p>
@@ -418,7 +418,7 @@
         </w:numPr>
       </w:pPr>
       <w:r>
-        <w:t xml:space="preserve">Manzana : 160 clientes</w:t>
+        <w:t xml:space="preserve">Piña : 174 clientes</w:t>
       </w:r>
     </w:p>
     <w:p>
@@ -429,7 +429,7 @@
         </w:numPr>
       </w:pPr>
       <w:r>
-        <w:t xml:space="preserve">Mora : 141 clientes</w:t>
+        <w:t xml:space="preserve">Banano : 137 clientes</w:t>
       </w:r>
     </w:p>
     <w:p>
@@ -440,7 +440,7 @@
         </w:numPr>
       </w:pPr>
       <w:r>
-        <w:t xml:space="preserve">Maracuyá : 127 clientes</w:t>
+        <w:t xml:space="preserve">Uva : 126 clientes</w:t>
       </w:r>
     </w:p>
     <w:p>
@@ -461,7 +461,7 @@
           <w:b/>
           <w:bCs/>
         </w:rPr>
-        <w:t xml:space="preserve">Durazno</w:t>
+        <w:t xml:space="preserve">Cereza</w:t>
       </w:r>
       <w:r>
         <w:t xml:space="preserve"> </w:t>
@@ -477,7 +477,7 @@
           <w:b/>
           <w:bCs/>
         </w:rPr>
-        <w:t xml:space="preserve">Manzana</w:t>
+        <w:t xml:space="preserve">Piña</w:t>
       </w:r>
       <w:r>
         <w:t xml:space="preserve">.</w:t>
@@ -506,7 +506,7 @@
         </w:numPr>
       </w:pPr>
       <w:r>
-        <w:t xml:space="preserve">El día con mayor número de ventas es: ** Viernes ** con 43 tortas vendidas.</w:t>
+        <w:t xml:space="preserve">El día con mayor número de ventas es: ** Lunes ** con 57 tortas vendidas.</w:t>
       </w:r>
     </w:p>
     <w:p>
@@ -527,7 +527,7 @@
         <w:t xml:space="preserve"> </w:t>
       </w:r>
       <w:r>
-        <w:t xml:space="preserve">Se venderán el viernes y los sabores serán durazno y manzana.</w:t>
+        <w:t xml:space="preserve">Se venderán el lunes y los sabores serán cereza y piña.</w:t>
       </w:r>
     </w:p>
     <w:p>
@@ -548,6 +548,27 @@
         <w:t xml:space="preserve"> </w:t>
       </w:r>
       <w:r>
+        <w:t xml:space="preserve">No identifica correctamente ni el día con mayor número de ventas ni los 2 sabores más preferidos. Revisa cuidadosamente ambos datos.</w:t>
+      </w:r>
+    </w:p>
+    <w:p>
+      <w:pPr>
+        <w:numPr>
+          <w:ilvl w:val="1"/>
+          <w:numId w:val="1005"/>
+        </w:numPr>
+      </w:pPr>
+      <w:r>
+        <w:rPr>
+          <w:b/>
+          <w:bCs/>
+        </w:rPr>
+        <w:t xml:space="preserve">Incorrecto.</w:t>
+      </w:r>
+      <w:r>
+        <w:t xml:space="preserve"> </w:t>
+      </w:r>
+      <w:r>
         <w:t xml:space="preserve">Identifica correctamente los 2 sabores más preferidos, pero no selecciona el día con mayor número de ventas según el gráfico.</w:t>
       </w:r>
     </w:p>
@@ -591,27 +612,6 @@
       </w:r>
       <w:r>
         <w:t xml:space="preserve">Identifica correctamente el día con mayor número de ventas, pero no selecciona los 2 sabores más preferidos según la tabla de encuesta.</w:t>
-      </w:r>
-    </w:p>
-    <w:p>
-      <w:pPr>
-        <w:numPr>
-          <w:ilvl w:val="1"/>
-          <w:numId w:val="1005"/>
-        </w:numPr>
-      </w:pPr>
-      <w:r>
-        <w:rPr>
-          <w:b/>
-          <w:bCs/>
-        </w:rPr>
-        <w:t xml:space="preserve">Incorrecto.</w:t>
-      </w:r>
-      <w:r>
-        <w:t xml:space="preserve"> </w:t>
-      </w:r>
-      <w:r>
-        <w:t xml:space="preserve">No identifica correctamente ni el día con mayor número de ventas ni los 2 sabores más preferidos. Revisa cuidadosamente ambos datos.</w:t>
       </w:r>
     </w:p>
     <w:p>
@@ -645,7 +645,7 @@
       <w:r>
         <w:drawing>
           <wp:inline>
-            <wp:extent cx="2879999" cy="1112123"/>
+            <wp:extent cx="2879999" cy="1032369"/>
             <wp:effectExtent b="0" l="0" r="0" t="0"/>
             <wp:docPr descr="image" title="" id="27" name="Picture"/>
             <a:graphic>
@@ -666,7 +666,7 @@
                   <pic:spPr bwMode="auto">
                     <a:xfrm>
                       <a:off x="0" y="0"/>
-                      <a:ext cx="2879999" cy="1112123"/>
+                      <a:ext cx="2879999" cy="1032369"/>
                     </a:xfrm>
                     <a:prstGeom prst="rect">
                       <a:avLst/>
@@ -780,7 +780,7 @@
         </w:numPr>
       </w:pPr>
       <w:r>
-        <w:t xml:space="preserve">El día miércoles se ofrecerán sabores coco y limón.</w:t>
+        <w:t xml:space="preserve">La promoción será el viernes con tortas de mora y manzana.</w:t>
       </w:r>
     </w:p>
     <w:p>
@@ -791,7 +791,7 @@
         </w:numPr>
       </w:pPr>
       <w:r>
-        <w:t xml:space="preserve">La promoción será el sábado con tortas de coco y limón.</w:t>
+        <w:t xml:space="preserve">Se venderán el sábado y los sabores serán mora y manzana.</w:t>
       </w:r>
     </w:p>
     <w:p>
@@ -802,7 +802,7 @@
         </w:numPr>
       </w:pPr>
       <w:r>
-        <w:t xml:space="preserve">La promoción será el sábado con tortas de fresa y limón.</w:t>
+        <w:t xml:space="preserve">La promoción será el viernes con tortas de maracuyá y manzana.</w:t>
       </w:r>
     </w:p>
     <w:p>
@@ -813,7 +813,7 @@
         </w:numPr>
       </w:pPr>
       <w:r>
-        <w:t xml:space="preserve">Se venderán el sábado y los sabores serán vainilla y fresa.</w:t>
+        <w:t xml:space="preserve">Se venderán el lunes y los sabores serán durazno y mora.</w:t>
       </w:r>
     </w:p>
     <w:p>
@@ -902,7 +902,7 @@
         </w:numPr>
       </w:pPr>
       <w:r>
-        <w:t xml:space="preserve">Coco : 176 clientes</w:t>
+        <w:t xml:space="preserve">Mora : 191 clientes</w:t>
       </w:r>
     </w:p>
     <w:p>
@@ -913,7 +913,7 @@
         </w:numPr>
       </w:pPr>
       <w:r>
-        <w:t xml:space="preserve">Limón : 154 clientes</w:t>
+        <w:t xml:space="preserve">Manzana : 170 clientes</w:t>
       </w:r>
     </w:p>
     <w:p>
@@ -924,7 +924,7 @@
         </w:numPr>
       </w:pPr>
       <w:r>
-        <w:t xml:space="preserve">Fresa : 127 clientes</w:t>
+        <w:t xml:space="preserve">Maracuyá : 156 clientes</w:t>
       </w:r>
     </w:p>
     <w:p>
@@ -935,7 +935,7 @@
         </w:numPr>
       </w:pPr>
       <w:r>
-        <w:t xml:space="preserve">Vainilla : 123 clientes</w:t>
+        <w:t xml:space="preserve">Durazno : 130 clientes</w:t>
       </w:r>
     </w:p>
     <w:p>
@@ -956,7 +956,7 @@
           <w:b/>
           <w:bCs/>
         </w:rPr>
-        <w:t xml:space="preserve">Coco</w:t>
+        <w:t xml:space="preserve">Mora</w:t>
       </w:r>
       <w:r>
         <w:t xml:space="preserve"> </w:t>
@@ -972,7 +972,7 @@
           <w:b/>
           <w:bCs/>
         </w:rPr>
-        <w:t xml:space="preserve">Limón</w:t>
+        <w:t xml:space="preserve">Manzana</w:t>
       </w:r>
       <w:r>
         <w:t xml:space="preserve">.</w:t>
@@ -1001,7 +1001,7 @@
         </w:numPr>
       </w:pPr>
       <w:r>
-        <w:t xml:space="preserve">El día con mayor número de ventas es: ** Sábado ** con 38 tortas vendidas.</w:t>
+        <w:t xml:space="preserve">El día con mayor número de ventas es: ** Viernes ** con 56 tortas vendidas.</w:t>
       </w:r>
     </w:p>
     <w:p>
@@ -1022,7 +1022,7 @@
         <w:t xml:space="preserve"> </w:t>
       </w:r>
       <w:r>
-        <w:t xml:space="preserve">Se venderán el sábado y los sabores serán coco y limón.</w:t>
+        <w:t xml:space="preserve">Se venderán el viernes y los sabores serán mora y manzana.</w:t>
       </w:r>
     </w:p>
     <w:p>
@@ -1037,76 +1037,76 @@
           <w:b/>
           <w:bCs/>
         </w:rPr>
+        <w:t xml:space="preserve">Correcto.</w:t>
+      </w:r>
+      <w:r>
+        <w:t xml:space="preserve"> </w:t>
+      </w:r>
+      <w:r>
+        <w:t xml:space="preserve">Identifica correctamente tanto el día con mayor número de ventas como los 2 sabores más preferidos según los datos presentados.</w:t>
+      </w:r>
+    </w:p>
+    <w:p>
+      <w:pPr>
+        <w:numPr>
+          <w:ilvl w:val="1"/>
+          <w:numId w:val="1009"/>
+        </w:numPr>
+      </w:pPr>
+      <w:r>
+        <w:rPr>
+          <w:b/>
+          <w:bCs/>
+        </w:rPr>
         <w:t xml:space="preserve">Incorrecto.</w:t>
       </w:r>
       <w:r>
         <w:t xml:space="preserve"> </w:t>
       </w:r>
       <w:r>
+        <w:t xml:space="preserve">Identifica correctamente los 2 sabores más preferidos, pero no selecciona el día con mayor número de ventas según el gráfico.</w:t>
+      </w:r>
+    </w:p>
+    <w:p>
+      <w:pPr>
+        <w:numPr>
+          <w:ilvl w:val="1"/>
+          <w:numId w:val="1009"/>
+        </w:numPr>
+      </w:pPr>
+      <w:r>
+        <w:rPr>
+          <w:b/>
+          <w:bCs/>
+        </w:rPr>
+        <w:t xml:space="preserve">Incorrecto.</w:t>
+      </w:r>
+      <w:r>
+        <w:t xml:space="preserve"> </w:t>
+      </w:r>
+      <w:r>
+        <w:t xml:space="preserve">Identifica correctamente el día con mayor número de ventas, pero no selecciona los 2 sabores más preferidos según la tabla de encuesta.</w:t>
+      </w:r>
+    </w:p>
+    <w:p>
+      <w:pPr>
+        <w:numPr>
+          <w:ilvl w:val="1"/>
+          <w:numId w:val="1009"/>
+        </w:numPr>
+      </w:pPr>
+      <w:r>
+        <w:rPr>
+          <w:b/>
+          <w:bCs/>
+        </w:rPr>
+        <w:t xml:space="preserve">Incorrecto.</w:t>
+      </w:r>
+      <w:r>
+        <w:t xml:space="preserve"> </w:t>
+      </w:r>
+      <w:r>
         <w:t xml:space="preserve">No identifica correctamente ni el día con mayor número de ventas ni los 2 sabores más preferidos. Revisa cuidadosamente ambos datos.</w:t>
-      </w:r>
-    </w:p>
-    <w:p>
-      <w:pPr>
-        <w:numPr>
-          <w:ilvl w:val="1"/>
-          <w:numId w:val="1009"/>
-        </w:numPr>
-      </w:pPr>
-      <w:r>
-        <w:rPr>
-          <w:b/>
-          <w:bCs/>
-        </w:rPr>
-        <w:t xml:space="preserve">Correcto.</w:t>
-      </w:r>
-      <w:r>
-        <w:t xml:space="preserve"> </w:t>
-      </w:r>
-      <w:r>
-        <w:t xml:space="preserve">Identifica correctamente tanto el día con mayor número de ventas como los 2 sabores más preferidos según los datos presentados.</w:t>
-      </w:r>
-    </w:p>
-    <w:p>
-      <w:pPr>
-        <w:numPr>
-          <w:ilvl w:val="1"/>
-          <w:numId w:val="1009"/>
-        </w:numPr>
-      </w:pPr>
-      <w:r>
-        <w:rPr>
-          <w:b/>
-          <w:bCs/>
-        </w:rPr>
-        <w:t xml:space="preserve">Incorrecto.</w:t>
-      </w:r>
-      <w:r>
-        <w:t xml:space="preserve"> </w:t>
-      </w:r>
-      <w:r>
-        <w:t xml:space="preserve">Identifica correctamente los 2 sabores más preferidos, pero no selecciona el día con mayor número de ventas según el gráfico.</w:t>
-      </w:r>
-    </w:p>
-    <w:p>
-      <w:pPr>
-        <w:numPr>
-          <w:ilvl w:val="1"/>
-          <w:numId w:val="1009"/>
-        </w:numPr>
-      </w:pPr>
-      <w:r>
-        <w:rPr>
-          <w:b/>
-          <w:bCs/>
-        </w:rPr>
-        <w:t xml:space="preserve">Incorrecto.</w:t>
-      </w:r>
-      <w:r>
-        <w:t xml:space="preserve"> </w:t>
-      </w:r>
-      <w:r>
-        <w:t xml:space="preserve">Identifica correctamente el día con mayor número de ventas, pero no selecciona los 2 sabores más preferidos según la tabla de encuesta.</w:t>
       </w:r>
     </w:p>
     <w:p>
@@ -1140,7 +1140,7 @@
       <w:r>
         <w:drawing>
           <wp:inline>
-            <wp:extent cx="2879999" cy="1089969"/>
+            <wp:extent cx="2879999" cy="1023507"/>
             <wp:effectExtent b="0" l="0" r="0" t="0"/>
             <wp:docPr descr="image" title="" id="33" name="Picture"/>
             <a:graphic>
@@ -1161,7 +1161,7 @@
                   <pic:spPr bwMode="auto">
                     <a:xfrm>
                       <a:off x="0" y="0"/>
-                      <a:ext cx="2879999" cy="1089969"/>
+                      <a:ext cx="2879999" cy="1023507"/>
                     </a:xfrm>
                     <a:prstGeom prst="rect">
                       <a:avLst/>
@@ -1275,7 +1275,7 @@
         </w:numPr>
       </w:pPr>
       <w:r>
-        <w:t xml:space="preserve">Se venderán el viernes y los sabores serán uva y piña.</w:t>
+        <w:t xml:space="preserve">El día domingo se ofrecerán sabores naranja y chocolate.</w:t>
       </w:r>
     </w:p>
     <w:p>
@@ -1286,7 +1286,7 @@
         </w:numPr>
       </w:pPr>
       <w:r>
-        <w:t xml:space="preserve">Se venderán el lunes y los sabores serán banano y cereza.</w:t>
+        <w:t xml:space="preserve">El día sábado se ofrecerán sabores naranja y chocolate.</w:t>
       </w:r>
     </w:p>
     <w:p>
@@ -1297,7 +1297,7 @@
         </w:numPr>
       </w:pPr>
       <w:r>
-        <w:t xml:space="preserve">El día domingo se ofrecerán sabores uva y piña.</w:t>
+        <w:t xml:space="preserve">Se venderán el sábado y los sabores serán nuez y almendra.</w:t>
       </w:r>
     </w:p>
     <w:p>
@@ -1308,7 +1308,7 @@
         </w:numPr>
       </w:pPr>
       <w:r>
-        <w:t xml:space="preserve">El día lunes se ofrecerán sabores uva y piña.</w:t>
+        <w:t xml:space="preserve">Se venderán el miércoles y los sabores serán naranja y chocolate.</w:t>
       </w:r>
     </w:p>
     <w:p>
@@ -1397,7 +1397,7 @@
         </w:numPr>
       </w:pPr>
       <w:r>
-        <w:t xml:space="preserve">Uva : 160 clientes</w:t>
+        <w:t xml:space="preserve">Naranja : 186 clientes</w:t>
       </w:r>
     </w:p>
     <w:p>
@@ -1408,7 +1408,7 @@
         </w:numPr>
       </w:pPr>
       <w:r>
-        <w:t xml:space="preserve">Piña : 149 clientes</w:t>
+        <w:t xml:space="preserve">Chocolate : 184 clientes</w:t>
       </w:r>
     </w:p>
     <w:p>
@@ -1419,7 +1419,7 @@
         </w:numPr>
       </w:pPr>
       <w:r>
-        <w:t xml:space="preserve">Cereza : 133 clientes</w:t>
+        <w:t xml:space="preserve">Nuez : 168 clientes</w:t>
       </w:r>
     </w:p>
     <w:p>
@@ -1430,7 +1430,7 @@
         </w:numPr>
       </w:pPr>
       <w:r>
-        <w:t xml:space="preserve">Banano : 120 clientes</w:t>
+        <w:t xml:space="preserve">Almendra : 149 clientes</w:t>
       </w:r>
     </w:p>
     <w:p>
@@ -1451,7 +1451,7 @@
           <w:b/>
           <w:bCs/>
         </w:rPr>
-        <w:t xml:space="preserve">Uva</w:t>
+        <w:t xml:space="preserve">Naranja</w:t>
       </w:r>
       <w:r>
         <w:t xml:space="preserve"> </w:t>
@@ -1467,7 +1467,7 @@
           <w:b/>
           <w:bCs/>
         </w:rPr>
-        <w:t xml:space="preserve">Piña</w:t>
+        <w:t xml:space="preserve">Chocolate</w:t>
       </w:r>
       <w:r>
         <w:t xml:space="preserve">.</w:t>
@@ -1496,7 +1496,7 @@
         </w:numPr>
       </w:pPr>
       <w:r>
-        <w:t xml:space="preserve">El día con mayor número de ventas es: ** Lunes ** con 46 tortas vendidas.</w:t>
+        <w:t xml:space="preserve">El día con mayor número de ventas es: ** Sábado ** con 53 tortas vendidas.</w:t>
       </w:r>
     </w:p>
     <w:p>
@@ -1517,7 +1517,7 @@
         <w:t xml:space="preserve"> </w:t>
       </w:r>
       <w:r>
-        <w:t xml:space="preserve">Se venderán el lunes y los sabores serán uva y piña.</w:t>
+        <w:t xml:space="preserve">Se venderán el sábado y los sabores serán naranja y chocolate.</w:t>
       </w:r>
     </w:p>
     <w:p>
@@ -1538,70 +1538,70 @@
         <w:t xml:space="preserve"> </w:t>
       </w:r>
       <w:r>
+        <w:t xml:space="preserve">No identifica correctamente ni el día con mayor número de ventas ni los 2 sabores más preferidos. Revisa cuidadosamente ambos datos.</w:t>
+      </w:r>
+    </w:p>
+    <w:p>
+      <w:pPr>
+        <w:numPr>
+          <w:ilvl w:val="1"/>
+          <w:numId w:val="1013"/>
+        </w:numPr>
+      </w:pPr>
+      <w:r>
+        <w:rPr>
+          <w:b/>
+          <w:bCs/>
+        </w:rPr>
+        <w:t xml:space="preserve">Correcto.</w:t>
+      </w:r>
+      <w:r>
+        <w:t xml:space="preserve"> </w:t>
+      </w:r>
+      <w:r>
+        <w:t xml:space="preserve">Identifica correctamente tanto el día con mayor número de ventas como los 2 sabores más preferidos según los datos presentados.</w:t>
+      </w:r>
+    </w:p>
+    <w:p>
+      <w:pPr>
+        <w:numPr>
+          <w:ilvl w:val="1"/>
+          <w:numId w:val="1013"/>
+        </w:numPr>
+      </w:pPr>
+      <w:r>
+        <w:rPr>
+          <w:b/>
+          <w:bCs/>
+        </w:rPr>
+        <w:t xml:space="preserve">Incorrecto.</w:t>
+      </w:r>
+      <w:r>
+        <w:t xml:space="preserve"> </w:t>
+      </w:r>
+      <w:r>
+        <w:t xml:space="preserve">Identifica correctamente el día con mayor número de ventas, pero no selecciona los 2 sabores más preferidos según la tabla de encuesta.</w:t>
+      </w:r>
+    </w:p>
+    <w:p>
+      <w:pPr>
+        <w:numPr>
+          <w:ilvl w:val="1"/>
+          <w:numId w:val="1013"/>
+        </w:numPr>
+      </w:pPr>
+      <w:r>
+        <w:rPr>
+          <w:b/>
+          <w:bCs/>
+        </w:rPr>
+        <w:t xml:space="preserve">Incorrecto.</w:t>
+      </w:r>
+      <w:r>
+        <w:t xml:space="preserve"> </w:t>
+      </w:r>
+      <w:r>
         <w:t xml:space="preserve">Identifica correctamente los 2 sabores más preferidos, pero no selecciona el día con mayor número de ventas según el gráfico.</w:t>
-      </w:r>
-    </w:p>
-    <w:p>
-      <w:pPr>
-        <w:numPr>
-          <w:ilvl w:val="1"/>
-          <w:numId w:val="1013"/>
-        </w:numPr>
-      </w:pPr>
-      <w:r>
-        <w:rPr>
-          <w:b/>
-          <w:bCs/>
-        </w:rPr>
-        <w:t xml:space="preserve">Incorrecto.</w:t>
-      </w:r>
-      <w:r>
-        <w:t xml:space="preserve"> </w:t>
-      </w:r>
-      <w:r>
-        <w:t xml:space="preserve">Identifica correctamente el día con mayor número de ventas, pero no selecciona los 2 sabores más preferidos según la tabla de encuesta.</w:t>
-      </w:r>
-    </w:p>
-    <w:p>
-      <w:pPr>
-        <w:numPr>
-          <w:ilvl w:val="1"/>
-          <w:numId w:val="1013"/>
-        </w:numPr>
-      </w:pPr>
-      <w:r>
-        <w:rPr>
-          <w:b/>
-          <w:bCs/>
-        </w:rPr>
-        <w:t xml:space="preserve">Incorrecto.</w:t>
-      </w:r>
-      <w:r>
-        <w:t xml:space="preserve"> </w:t>
-      </w:r>
-      <w:r>
-        <w:t xml:space="preserve">No identifica correctamente ni el día con mayor número de ventas ni los 2 sabores más preferidos. Revisa cuidadosamente ambos datos.</w:t>
-      </w:r>
-    </w:p>
-    <w:p>
-      <w:pPr>
-        <w:numPr>
-          <w:ilvl w:val="1"/>
-          <w:numId w:val="1013"/>
-        </w:numPr>
-      </w:pPr>
-      <w:r>
-        <w:rPr>
-          <w:b/>
-          <w:bCs/>
-        </w:rPr>
-        <w:t xml:space="preserve">Correcto.</w:t>
-      </w:r>
-      <w:r>
-        <w:t xml:space="preserve"> </w:t>
-      </w:r>
-      <w:r>
-        <w:t xml:space="preserve">Identifica correctamente tanto el día con mayor número de ventas como los 2 sabores más preferidos según los datos presentados.</w:t>
       </w:r>
     </w:p>
     <w:p>
@@ -1770,7 +1770,7 @@
         </w:numPr>
       </w:pPr>
       <w:r>
-        <w:t xml:space="preserve">Se venderán el lunes y los sabores serán coco y vainilla.</w:t>
+        <w:t xml:space="preserve">El día sábado se ofrecerán sabores vainilla y coco.</w:t>
       </w:r>
     </w:p>
     <w:p>
@@ -1781,7 +1781,7 @@
         </w:numPr>
       </w:pPr>
       <w:r>
-        <w:t xml:space="preserve">Se venderán el miércoles y los sabores serán coco y vainilla.</w:t>
+        <w:t xml:space="preserve">Se venderán el lunes y los sabores serán vainilla y coco.</w:t>
       </w:r>
     </w:p>
     <w:p>
@@ -1792,7 +1792,7 @@
         </w:numPr>
       </w:pPr>
       <w:r>
-        <w:t xml:space="preserve">Se venderán el miércoles y los sabores serán fresa y limón.</w:t>
+        <w:t xml:space="preserve">Se venderán el lunes y los sabores serán fresa y limón.</w:t>
       </w:r>
     </w:p>
     <w:p>
@@ -1803,7 +1803,7 @@
         </w:numPr>
       </w:pPr>
       <w:r>
-        <w:t xml:space="preserve">El día viernes se ofrecerán sabores coco y vainilla.</w:t>
+        <w:t xml:space="preserve">Se venderán el jueves y los sabores serán vainilla y coco.</w:t>
       </w:r>
     </w:p>
     <w:p>
@@ -1892,7 +1892,7 @@
         </w:numPr>
       </w:pPr>
       <w:r>
-        <w:t xml:space="preserve">Coco : 192 clientes</w:t>
+        <w:t xml:space="preserve">Vainilla : 193 clientes</w:t>
       </w:r>
     </w:p>
     <w:p>
@@ -1903,7 +1903,7 @@
         </w:numPr>
       </w:pPr>
       <w:r>
-        <w:t xml:space="preserve">Vainilla : 180 clientes</w:t>
+        <w:t xml:space="preserve">Coco : 178 clientes</w:t>
       </w:r>
     </w:p>
     <w:p>
@@ -1914,7 +1914,7 @@
         </w:numPr>
       </w:pPr>
       <w:r>
-        <w:t xml:space="preserve">Fresa : 166 clientes</w:t>
+        <w:t xml:space="preserve">Fresa : 159 clientes</w:t>
       </w:r>
     </w:p>
     <w:p>
@@ -1925,7 +1925,7 @@
         </w:numPr>
       </w:pPr>
       <w:r>
-        <w:t xml:space="preserve">Limón : 156 clientes</w:t>
+        <w:t xml:space="preserve">Limón : 125 clientes</w:t>
       </w:r>
     </w:p>
     <w:p>
@@ -1946,25 +1946,25 @@
           <w:b/>
           <w:bCs/>
         </w:rPr>
+        <w:t xml:space="preserve">Vainilla</w:t>
+      </w:r>
+      <w:r>
+        <w:t xml:space="preserve"> </w:t>
+      </w:r>
+      <w:r>
+        <w:t xml:space="preserve">y</w:t>
+      </w:r>
+      <w:r>
+        <w:t xml:space="preserve"> </w:t>
+      </w:r>
+      <w:r>
+        <w:rPr>
+          <w:b/>
+          <w:bCs/>
+        </w:rPr>
         <w:t xml:space="preserve">Coco</w:t>
       </w:r>
       <w:r>
-        <w:t xml:space="preserve"> </w:t>
-      </w:r>
-      <w:r>
-        <w:t xml:space="preserve">y</w:t>
-      </w:r>
-      <w:r>
-        <w:t xml:space="preserve"> </w:t>
-      </w:r>
-      <w:r>
-        <w:rPr>
-          <w:b/>
-          <w:bCs/>
-        </w:rPr>
-        <w:t xml:space="preserve">Vainilla</w:t>
-      </w:r>
-      <w:r>
         <w:t xml:space="preserve">.</w:t>
       </w:r>
     </w:p>
@@ -1991,7 +1991,7 @@
         </w:numPr>
       </w:pPr>
       <w:r>
-        <w:t xml:space="preserve">El día con mayor número de ventas es: ** Miércoles ** con 47 tortas vendidas.</w:t>
+        <w:t xml:space="preserve">El día con mayor número de ventas es: ** Lunes ** con 48 tortas vendidas.</w:t>
       </w:r>
     </w:p>
     <w:p>
@@ -2012,7 +2012,7 @@
         <w:t xml:space="preserve"> </w:t>
       </w:r>
       <w:r>
-        <w:t xml:space="preserve">Se venderán el miércoles y los sabores serán coco y vainilla.</w:t>
+        <w:t xml:space="preserve">Se venderán el lunes y los sabores serán vainilla y coco.</w:t>
       </w:r>
     </w:p>
     <w:p>
@@ -2033,70 +2033,70 @@
         <w:t xml:space="preserve"> </w:t>
       </w:r>
       <w:r>
+        <w:t xml:space="preserve">No identifica correctamente ni el día con mayor número de ventas ni los 2 sabores más preferidos. Revisa cuidadosamente ambos datos.</w:t>
+      </w:r>
+    </w:p>
+    <w:p>
+      <w:pPr>
+        <w:numPr>
+          <w:ilvl w:val="1"/>
+          <w:numId w:val="1017"/>
+        </w:numPr>
+      </w:pPr>
+      <w:r>
+        <w:rPr>
+          <w:b/>
+          <w:bCs/>
+        </w:rPr>
+        <w:t xml:space="preserve">Correcto.</w:t>
+      </w:r>
+      <w:r>
+        <w:t xml:space="preserve"> </w:t>
+      </w:r>
+      <w:r>
+        <w:t xml:space="preserve">Identifica correctamente tanto el día con mayor número de ventas como los 2 sabores más preferidos según los datos presentados.</w:t>
+      </w:r>
+    </w:p>
+    <w:p>
+      <w:pPr>
+        <w:numPr>
+          <w:ilvl w:val="1"/>
+          <w:numId w:val="1017"/>
+        </w:numPr>
+      </w:pPr>
+      <w:r>
+        <w:rPr>
+          <w:b/>
+          <w:bCs/>
+        </w:rPr>
+        <w:t xml:space="preserve">Incorrecto.</w:t>
+      </w:r>
+      <w:r>
+        <w:t xml:space="preserve"> </w:t>
+      </w:r>
+      <w:r>
+        <w:t xml:space="preserve">Identifica correctamente el día con mayor número de ventas, pero no selecciona los 2 sabores más preferidos según la tabla de encuesta.</w:t>
+      </w:r>
+    </w:p>
+    <w:p>
+      <w:pPr>
+        <w:numPr>
+          <w:ilvl w:val="1"/>
+          <w:numId w:val="1017"/>
+        </w:numPr>
+      </w:pPr>
+      <w:r>
+        <w:rPr>
+          <w:b/>
+          <w:bCs/>
+        </w:rPr>
+        <w:t xml:space="preserve">Incorrecto.</w:t>
+      </w:r>
+      <w:r>
+        <w:t xml:space="preserve"> </w:t>
+      </w:r>
+      <w:r>
         <w:t xml:space="preserve">Identifica correctamente los 2 sabores más preferidos, pero no selecciona el día con mayor número de ventas según el gráfico.</w:t>
-      </w:r>
-    </w:p>
-    <w:p>
-      <w:pPr>
-        <w:numPr>
-          <w:ilvl w:val="1"/>
-          <w:numId w:val="1017"/>
-        </w:numPr>
-      </w:pPr>
-      <w:r>
-        <w:rPr>
-          <w:b/>
-          <w:bCs/>
-        </w:rPr>
-        <w:t xml:space="preserve">Correcto.</w:t>
-      </w:r>
-      <w:r>
-        <w:t xml:space="preserve"> </w:t>
-      </w:r>
-      <w:r>
-        <w:t xml:space="preserve">Identifica correctamente tanto el día con mayor número de ventas como los 2 sabores más preferidos según los datos presentados.</w:t>
-      </w:r>
-    </w:p>
-    <w:p>
-      <w:pPr>
-        <w:numPr>
-          <w:ilvl w:val="1"/>
-          <w:numId w:val="1017"/>
-        </w:numPr>
-      </w:pPr>
-      <w:r>
-        <w:rPr>
-          <w:b/>
-          <w:bCs/>
-        </w:rPr>
-        <w:t xml:space="preserve">Incorrecto.</w:t>
-      </w:r>
-      <w:r>
-        <w:t xml:space="preserve"> </w:t>
-      </w:r>
-      <w:r>
-        <w:t xml:space="preserve">Identifica correctamente el día con mayor número de ventas, pero no selecciona los 2 sabores más preferidos según la tabla de encuesta.</w:t>
-      </w:r>
-    </w:p>
-    <w:p>
-      <w:pPr>
-        <w:numPr>
-          <w:ilvl w:val="1"/>
-          <w:numId w:val="1017"/>
-        </w:numPr>
-      </w:pPr>
-      <w:r>
-        <w:rPr>
-          <w:b/>
-          <w:bCs/>
-        </w:rPr>
-        <w:t xml:space="preserve">Incorrecto.</w:t>
-      </w:r>
-      <w:r>
-        <w:t xml:space="preserve"> </w:t>
-      </w:r>
-      <w:r>
-        <w:t xml:space="preserve">No identifica correctamente ni el día con mayor número de ventas ni los 2 sabores más preferidos. Revisa cuidadosamente ambos datos.</w:t>
       </w:r>
     </w:p>
     <w:p>
@@ -2130,7 +2130,7 @@
       <w:r>
         <w:drawing>
           <wp:inline>
-            <wp:extent cx="2879999" cy="1112123"/>
+            <wp:extent cx="2879999" cy="1032369"/>
             <wp:effectExtent b="0" l="0" r="0" t="0"/>
             <wp:docPr descr="image" title="" id="45" name="Picture"/>
             <a:graphic>
@@ -2151,7 +2151,7 @@
                   <pic:spPr bwMode="auto">
                     <a:xfrm>
                       <a:off x="0" y="0"/>
-                      <a:ext cx="2879999" cy="1112123"/>
+                      <a:ext cx="2879999" cy="1032369"/>
                     </a:xfrm>
                     <a:prstGeom prst="rect">
                       <a:avLst/>
@@ -2265,7 +2265,7 @@
         </w:numPr>
       </w:pPr>
       <w:r>
-        <w:t xml:space="preserve">Se venderán el lunes y los sabores serán fresa y vainilla.</w:t>
+        <w:t xml:space="preserve">Se venderán el martes y los sabores serán durazno y manzana.</w:t>
       </w:r>
     </w:p>
     <w:p>
@@ -2276,7 +2276,7 @@
         </w:numPr>
       </w:pPr>
       <w:r>
-        <w:t xml:space="preserve">La promoción será el sábado con tortas de coco y limón.</w:t>
+        <w:t xml:space="preserve">La promoción será el sábado con tortas de durazno y manzana.</w:t>
       </w:r>
     </w:p>
     <w:p>
@@ -2287,7 +2287,7 @@
         </w:numPr>
       </w:pPr>
       <w:r>
-        <w:t xml:space="preserve">Se venderán el martes y los sabores serán vainilla y limón.</w:t>
+        <w:t xml:space="preserve">Se venderán el domingo y los sabores serán mora y durazno.</w:t>
       </w:r>
     </w:p>
     <w:p>
@@ -2298,7 +2298,7 @@
         </w:numPr>
       </w:pPr>
       <w:r>
-        <w:t xml:space="preserve">La promoción será el sábado con tortas de vainilla y limón.</w:t>
+        <w:t xml:space="preserve">La promoción será el sábado con tortas de maracuyá y manzana.</w:t>
       </w:r>
     </w:p>
     <w:p>
@@ -2387,7 +2387,7 @@
         </w:numPr>
       </w:pPr>
       <w:r>
-        <w:t xml:space="preserve">Vainilla : 195 clientes</w:t>
+        <w:t xml:space="preserve">Durazno : 183 clientes</w:t>
       </w:r>
     </w:p>
     <w:p>
@@ -2398,7 +2398,7 @@
         </w:numPr>
       </w:pPr>
       <w:r>
-        <w:t xml:space="preserve">Limón : 164 clientes</w:t>
+        <w:t xml:space="preserve">Manzana : 168 clientes</w:t>
       </w:r>
     </w:p>
     <w:p>
@@ -2409,7 +2409,7 @@
         </w:numPr>
       </w:pPr>
       <w:r>
-        <w:t xml:space="preserve">Fresa : 147 clientes</w:t>
+        <w:t xml:space="preserve">Maracuyá : 153 clientes</w:t>
       </w:r>
     </w:p>
     <w:p>
@@ -2420,7 +2420,7 @@
         </w:numPr>
       </w:pPr>
       <w:r>
-        <w:t xml:space="preserve">Coco : 129 clientes</w:t>
+        <w:t xml:space="preserve">Mora : 140 clientes</w:t>
       </w:r>
     </w:p>
     <w:p>
@@ -2441,7 +2441,7 @@
           <w:b/>
           <w:bCs/>
         </w:rPr>
-        <w:t xml:space="preserve">Vainilla</w:t>
+        <w:t xml:space="preserve">Durazno</w:t>
       </w:r>
       <w:r>
         <w:t xml:space="preserve"> </w:t>
@@ -2457,7 +2457,7 @@
           <w:b/>
           <w:bCs/>
         </w:rPr>
-        <w:t xml:space="preserve">Limón</w:t>
+        <w:t xml:space="preserve">Manzana</w:t>
       </w:r>
       <w:r>
         <w:t xml:space="preserve">.</w:t>
@@ -2486,7 +2486,7 @@
         </w:numPr>
       </w:pPr>
       <w:r>
-        <w:t xml:space="preserve">El día con mayor número de ventas es: ** Sábado ** con 46 tortas vendidas.</w:t>
+        <w:t xml:space="preserve">El día con mayor número de ventas es: ** Sábado ** con 57 tortas vendidas.</w:t>
       </w:r>
     </w:p>
     <w:p>
@@ -2507,7 +2507,7 @@
         <w:t xml:space="preserve"> </w:t>
       </w:r>
       <w:r>
-        <w:t xml:space="preserve">Se venderán el sábado y los sabores serán vainilla y limón.</w:t>
+        <w:t xml:space="preserve">Se venderán el sábado y los sabores serán durazno y manzana.</w:t>
       </w:r>
     </w:p>
     <w:p>
@@ -2528,6 +2528,48 @@
         <w:t xml:space="preserve"> </w:t>
       </w:r>
       <w:r>
+        <w:t xml:space="preserve">Identifica correctamente los 2 sabores más preferidos, pero no selecciona el día con mayor número de ventas según el gráfico.</w:t>
+      </w:r>
+    </w:p>
+    <w:p>
+      <w:pPr>
+        <w:numPr>
+          <w:ilvl w:val="1"/>
+          <w:numId w:val="1021"/>
+        </w:numPr>
+      </w:pPr>
+      <w:r>
+        <w:rPr>
+          <w:b/>
+          <w:bCs/>
+        </w:rPr>
+        <w:t xml:space="preserve">Correcto.</w:t>
+      </w:r>
+      <w:r>
+        <w:t xml:space="preserve"> </w:t>
+      </w:r>
+      <w:r>
+        <w:t xml:space="preserve">Identifica correctamente tanto el día con mayor número de ventas como los 2 sabores más preferidos según los datos presentados.</w:t>
+      </w:r>
+    </w:p>
+    <w:p>
+      <w:pPr>
+        <w:numPr>
+          <w:ilvl w:val="1"/>
+          <w:numId w:val="1021"/>
+        </w:numPr>
+      </w:pPr>
+      <w:r>
+        <w:rPr>
+          <w:b/>
+          <w:bCs/>
+        </w:rPr>
+        <w:t xml:space="preserve">Incorrecto.</w:t>
+      </w:r>
+      <w:r>
+        <w:t xml:space="preserve"> </w:t>
+      </w:r>
+      <w:r>
         <w:t xml:space="preserve">No identifica correctamente ni el día con mayor número de ventas ni los 2 sabores más preferidos. Revisa cuidadosamente ambos datos.</w:t>
       </w:r>
     </w:p>
@@ -2550,48 +2592,6 @@
       </w:r>
       <w:r>
         <w:t xml:space="preserve">Identifica correctamente el día con mayor número de ventas, pero no selecciona los 2 sabores más preferidos según la tabla de encuesta.</w:t>
-      </w:r>
-    </w:p>
-    <w:p>
-      <w:pPr>
-        <w:numPr>
-          <w:ilvl w:val="1"/>
-          <w:numId w:val="1021"/>
-        </w:numPr>
-      </w:pPr>
-      <w:r>
-        <w:rPr>
-          <w:b/>
-          <w:bCs/>
-        </w:rPr>
-        <w:t xml:space="preserve">Incorrecto.</w:t>
-      </w:r>
-      <w:r>
-        <w:t xml:space="preserve"> </w:t>
-      </w:r>
-      <w:r>
-        <w:t xml:space="preserve">Identifica correctamente los 2 sabores más preferidos, pero no selecciona el día con mayor número de ventas según el gráfico.</w:t>
-      </w:r>
-    </w:p>
-    <w:p>
-      <w:pPr>
-        <w:numPr>
-          <w:ilvl w:val="1"/>
-          <w:numId w:val="1021"/>
-        </w:numPr>
-      </w:pPr>
-      <w:r>
-        <w:rPr>
-          <w:b/>
-          <w:bCs/>
-        </w:rPr>
-        <w:t xml:space="preserve">Correcto.</w:t>
-      </w:r>
-      <w:r>
-        <w:t xml:space="preserve"> </w:t>
-      </w:r>
-      <w:r>
-        <w:t xml:space="preserve">Identifica correctamente tanto el día con mayor número de ventas como los 2 sabores más preferidos según los datos presentados.</w:t>
       </w:r>
     </w:p>
     <w:p>
@@ -2625,7 +2625,7 @@
       <w:r>
         <w:drawing>
           <wp:inline>
-            <wp:extent cx="2879999" cy="1089969"/>
+            <wp:extent cx="2879999" cy="1023507"/>
             <wp:effectExtent b="0" l="0" r="0" t="0"/>
             <wp:docPr descr="image" title="" id="51" name="Picture"/>
             <a:graphic>
@@ -2646,7 +2646,7 @@
                   <pic:spPr bwMode="auto">
                     <a:xfrm>
                       <a:off x="0" y="0"/>
-                      <a:ext cx="2879999" cy="1089969"/>
+                      <a:ext cx="2879999" cy="1023507"/>
                     </a:xfrm>
                     <a:prstGeom prst="rect">
                       <a:avLst/>
@@ -2760,7 +2760,7 @@
         </w:numPr>
       </w:pPr>
       <w:r>
-        <w:t xml:space="preserve">La promoción será el jueves con tortas de banano y uva.</w:t>
+        <w:t xml:space="preserve">La promoción será el miércoles con tortas de naranja y nuez.</w:t>
       </w:r>
     </w:p>
     <w:p>
@@ -2771,7 +2771,7 @@
         </w:numPr>
       </w:pPr>
       <w:r>
-        <w:t xml:space="preserve">Se venderán el domingo y los sabores serán banano y uva.</w:t>
+        <w:t xml:space="preserve">Se venderán el miércoles y los sabores serán chocolate y naranja.</w:t>
       </w:r>
     </w:p>
     <w:p>
@@ -2782,7 +2782,7 @@
         </w:numPr>
       </w:pPr>
       <w:r>
-        <w:t xml:space="preserve">La promoción será el jueves con tortas de cereza y uva.</w:t>
+        <w:t xml:space="preserve">Se venderán el viernes y los sabores serán almendra y nuez.</w:t>
       </w:r>
     </w:p>
     <w:p>
@@ -2793,7 +2793,7 @@
         </w:numPr>
       </w:pPr>
       <w:r>
-        <w:t xml:space="preserve">Se venderán el viernes y los sabores serán piña y banano.</w:t>
+        <w:t xml:space="preserve">La promoción será el miércoles con tortas de almendra y nuez.</w:t>
       </w:r>
     </w:p>
     <w:p>
@@ -2882,7 +2882,7 @@
         </w:numPr>
       </w:pPr>
       <w:r>
-        <w:t xml:space="preserve">Banano : 196 clientes</w:t>
+        <w:t xml:space="preserve">Almendra : 197 clientes</w:t>
       </w:r>
     </w:p>
     <w:p>
@@ -2893,7 +2893,7 @@
         </w:numPr>
       </w:pPr>
       <w:r>
-        <w:t xml:space="preserve">Uva : 159 clientes</w:t>
+        <w:t xml:space="preserve">Nuez : 160 clientes</w:t>
       </w:r>
     </w:p>
     <w:p>
@@ -2904,7 +2904,7 @@
         </w:numPr>
       </w:pPr>
       <w:r>
-        <w:t xml:space="preserve">Piña : 147 clientes</w:t>
+        <w:t xml:space="preserve">Chocolate : 146 clientes</w:t>
       </w:r>
     </w:p>
     <w:p>
@@ -2915,7 +2915,7 @@
         </w:numPr>
       </w:pPr>
       <w:r>
-        <w:t xml:space="preserve">Cereza : 122 clientes</w:t>
+        <w:t xml:space="preserve">Naranja : 136 clientes</w:t>
       </w:r>
     </w:p>
     <w:p>
@@ -2936,7 +2936,7 @@
           <w:b/>
           <w:bCs/>
         </w:rPr>
-        <w:t xml:space="preserve">Banano</w:t>
+        <w:t xml:space="preserve">Almendra</w:t>
       </w:r>
       <w:r>
         <w:t xml:space="preserve"> </w:t>
@@ -2952,7 +2952,7 @@
           <w:b/>
           <w:bCs/>
         </w:rPr>
-        <w:t xml:space="preserve">Uva</w:t>
+        <w:t xml:space="preserve">Nuez</w:t>
       </w:r>
       <w:r>
         <w:t xml:space="preserve">.</w:t>
@@ -2981,7 +2981,7 @@
         </w:numPr>
       </w:pPr>
       <w:r>
-        <w:t xml:space="preserve">El día con mayor número de ventas es: ** Jueves ** con 48 tortas vendidas.</w:t>
+        <w:t xml:space="preserve">El día con mayor número de ventas es: ** Miércoles ** con 51 tortas vendidas.</w:t>
       </w:r>
     </w:p>
     <w:p>
@@ -3002,7 +3002,7 @@
         <w:t xml:space="preserve"> </w:t>
       </w:r>
       <w:r>
-        <w:t xml:space="preserve">Se venderán el jueves y los sabores serán banano y uva.</w:t>
+        <w:t xml:space="preserve">Se venderán el miércoles y los sabores serán almendra y nuez.</w:t>
       </w:r>
     </w:p>
     <w:p>
@@ -3017,6 +3017,69 @@
           <w:b/>
           <w:bCs/>
         </w:rPr>
+        <w:t xml:space="preserve">Incorrecto.</w:t>
+      </w:r>
+      <w:r>
+        <w:t xml:space="preserve"> </w:t>
+      </w:r>
+      <w:r>
+        <w:t xml:space="preserve">Identifica correctamente los 2 sabores más preferidos, pero no selecciona el día con mayor número de ventas según el gráfico.</w:t>
+      </w:r>
+    </w:p>
+    <w:p>
+      <w:pPr>
+        <w:numPr>
+          <w:ilvl w:val="1"/>
+          <w:numId w:val="1025"/>
+        </w:numPr>
+      </w:pPr>
+      <w:r>
+        <w:rPr>
+          <w:b/>
+          <w:bCs/>
+        </w:rPr>
+        <w:t xml:space="preserve">Incorrecto.</w:t>
+      </w:r>
+      <w:r>
+        <w:t xml:space="preserve"> </w:t>
+      </w:r>
+      <w:r>
+        <w:t xml:space="preserve">Identifica correctamente el día con mayor número de ventas, pero no selecciona los 2 sabores más preferidos según la tabla de encuesta.</w:t>
+      </w:r>
+    </w:p>
+    <w:p>
+      <w:pPr>
+        <w:numPr>
+          <w:ilvl w:val="1"/>
+          <w:numId w:val="1025"/>
+        </w:numPr>
+      </w:pPr>
+      <w:r>
+        <w:rPr>
+          <w:b/>
+          <w:bCs/>
+        </w:rPr>
+        <w:t xml:space="preserve">Incorrecto.</w:t>
+      </w:r>
+      <w:r>
+        <w:t xml:space="preserve"> </w:t>
+      </w:r>
+      <w:r>
+        <w:t xml:space="preserve">No identifica correctamente ni el día con mayor número de ventas ni los 2 sabores más preferidos. Revisa cuidadosamente ambos datos.</w:t>
+      </w:r>
+    </w:p>
+    <w:p>
+      <w:pPr>
+        <w:numPr>
+          <w:ilvl w:val="1"/>
+          <w:numId w:val="1025"/>
+        </w:numPr>
+      </w:pPr>
+      <w:r>
+        <w:rPr>
+          <w:b/>
+          <w:bCs/>
+        </w:rPr>
         <w:t xml:space="preserve">Correcto.</w:t>
       </w:r>
       <w:r>
@@ -3024,69 +3087,6 @@
       </w:r>
       <w:r>
         <w:t xml:space="preserve">Identifica correctamente tanto el día con mayor número de ventas como los 2 sabores más preferidos según los datos presentados.</w:t>
-      </w:r>
-    </w:p>
-    <w:p>
-      <w:pPr>
-        <w:numPr>
-          <w:ilvl w:val="1"/>
-          <w:numId w:val="1025"/>
-        </w:numPr>
-      </w:pPr>
-      <w:r>
-        <w:rPr>
-          <w:b/>
-          <w:bCs/>
-        </w:rPr>
-        <w:t xml:space="preserve">Incorrecto.</w:t>
-      </w:r>
-      <w:r>
-        <w:t xml:space="preserve"> </w:t>
-      </w:r>
-      <w:r>
-        <w:t xml:space="preserve">Identifica correctamente los 2 sabores más preferidos, pero no selecciona el día con mayor número de ventas según el gráfico.</w:t>
-      </w:r>
-    </w:p>
-    <w:p>
-      <w:pPr>
-        <w:numPr>
-          <w:ilvl w:val="1"/>
-          <w:numId w:val="1025"/>
-        </w:numPr>
-      </w:pPr>
-      <w:r>
-        <w:rPr>
-          <w:b/>
-          <w:bCs/>
-        </w:rPr>
-        <w:t xml:space="preserve">Incorrecto.</w:t>
-      </w:r>
-      <w:r>
-        <w:t xml:space="preserve"> </w:t>
-      </w:r>
-      <w:r>
-        <w:t xml:space="preserve">Identifica correctamente el día con mayor número de ventas, pero no selecciona los 2 sabores más preferidos según la tabla de encuesta.</w:t>
-      </w:r>
-    </w:p>
-    <w:p>
-      <w:pPr>
-        <w:numPr>
-          <w:ilvl w:val="1"/>
-          <w:numId w:val="1025"/>
-        </w:numPr>
-      </w:pPr>
-      <w:r>
-        <w:rPr>
-          <w:b/>
-          <w:bCs/>
-        </w:rPr>
-        <w:t xml:space="preserve">Incorrecto.</w:t>
-      </w:r>
-      <w:r>
-        <w:t xml:space="preserve"> </w:t>
-      </w:r>
-      <w:r>
-        <w:t xml:space="preserve">No identifica correctamente ni el día con mayor número de ventas ni los 2 sabores más preferidos. Revisa cuidadosamente ambos datos.</w:t>
       </w:r>
     </w:p>
     <w:p>
@@ -3255,7 +3255,7 @@
         </w:numPr>
       </w:pPr>
       <w:r>
-        <w:t xml:space="preserve">Se venderán el sábado y los sabores serán miel y canela.</w:t>
+        <w:t xml:space="preserve">La promoción será el sábado con tortas de miel y café.</w:t>
       </w:r>
     </w:p>
     <w:p>
@@ -3266,7 +3266,7 @@
         </w:numPr>
       </w:pPr>
       <w:r>
-        <w:t xml:space="preserve">Se venderán el miércoles y los sabores serán caramelo y café.</w:t>
+        <w:t xml:space="preserve">La promoción será el sábado con tortas de canela y café.</w:t>
       </w:r>
     </w:p>
     <w:p>
@@ -3277,7 +3277,7 @@
         </w:numPr>
       </w:pPr>
       <w:r>
-        <w:t xml:space="preserve">Se venderán el sábado y los sabores serán caramelo y café.</w:t>
+        <w:t xml:space="preserve">El día domingo se ofrecerán sabores canela y café.</w:t>
       </w:r>
     </w:p>
     <w:p>
@@ -3288,7 +3288,7 @@
         </w:numPr>
       </w:pPr>
       <w:r>
-        <w:t xml:space="preserve">La promoción será el sábado con tortas de canela y café.</w:t>
+        <w:t xml:space="preserve">Se venderán el sábado y los sabores serán caramelo y miel.</w:t>
       </w:r>
     </w:p>
     <w:p>
@@ -3377,7 +3377,7 @@
         </w:numPr>
       </w:pPr>
       <w:r>
-        <w:t xml:space="preserve">Caramelo : 178 clientes</w:t>
+        <w:t xml:space="preserve">Canela : 195 clientes</w:t>
       </w:r>
     </w:p>
     <w:p>
@@ -3388,7 +3388,7 @@
         </w:numPr>
       </w:pPr>
       <w:r>
-        <w:t xml:space="preserve">Café : 167 clientes</w:t>
+        <w:t xml:space="preserve">Café : 189 clientes</w:t>
       </w:r>
     </w:p>
     <w:p>
@@ -3399,7 +3399,7 @@
         </w:numPr>
       </w:pPr>
       <w:r>
-        <w:t xml:space="preserve">Miel : 125 clientes</w:t>
+        <w:t xml:space="preserve">Caramelo : 145 clientes</w:t>
       </w:r>
     </w:p>
     <w:p>
@@ -3410,7 +3410,7 @@
         </w:numPr>
       </w:pPr>
       <w:r>
-        <w:t xml:space="preserve">Canela : 122 clientes</w:t>
+        <w:t xml:space="preserve">Miel : 145 clientes</w:t>
       </w:r>
     </w:p>
     <w:p>
@@ -3431,7 +3431,7 @@
           <w:b/>
           <w:bCs/>
         </w:rPr>
-        <w:t xml:space="preserve">Caramelo</w:t>
+        <w:t xml:space="preserve">Canela</w:t>
       </w:r>
       <w:r>
         <w:t xml:space="preserve"> </w:t>
@@ -3476,7 +3476,7 @@
         </w:numPr>
       </w:pPr>
       <w:r>
-        <w:t xml:space="preserve">El día con mayor número de ventas es: ** Sábado ** con 49 tortas vendidas.</w:t>
+        <w:t xml:space="preserve">El día con mayor número de ventas es: ** Sábado ** con 47 tortas vendidas.</w:t>
       </w:r>
     </w:p>
     <w:p>
@@ -3497,7 +3497,7 @@
         <w:t xml:space="preserve"> </w:t>
       </w:r>
       <w:r>
-        <w:t xml:space="preserve">Se venderán el sábado y los sabores serán caramelo y café.</w:t>
+        <w:t xml:space="preserve">Se venderán el sábado y los sabores serán canela y café.</w:t>
       </w:r>
     </w:p>
     <w:p>
@@ -3518,70 +3518,70 @@
         <w:t xml:space="preserve"> </w:t>
       </w:r>
       <w:r>
+        <w:t xml:space="preserve">Identifica correctamente los 2 sabores más preferidos, pero no selecciona el día con mayor número de ventas según el gráfico.</w:t>
+      </w:r>
+    </w:p>
+    <w:p>
+      <w:pPr>
+        <w:numPr>
+          <w:ilvl w:val="1"/>
+          <w:numId w:val="1029"/>
+        </w:numPr>
+      </w:pPr>
+      <w:r>
+        <w:rPr>
+          <w:b/>
+          <w:bCs/>
+        </w:rPr>
+        <w:t xml:space="preserve">Correcto.</w:t>
+      </w:r>
+      <w:r>
+        <w:t xml:space="preserve"> </w:t>
+      </w:r>
+      <w:r>
+        <w:t xml:space="preserve">Identifica correctamente tanto el día con mayor número de ventas como los 2 sabores más preferidos según los datos presentados.</w:t>
+      </w:r>
+    </w:p>
+    <w:p>
+      <w:pPr>
+        <w:numPr>
+          <w:ilvl w:val="1"/>
+          <w:numId w:val="1029"/>
+        </w:numPr>
+      </w:pPr>
+      <w:r>
+        <w:rPr>
+          <w:b/>
+          <w:bCs/>
+        </w:rPr>
+        <w:t xml:space="preserve">Incorrecto.</w:t>
+      </w:r>
+      <w:r>
+        <w:t xml:space="preserve"> </w:t>
+      </w:r>
+      <w:r>
+        <w:t xml:space="preserve">No identifica correctamente ni el día con mayor número de ventas ni los 2 sabores más preferidos. Revisa cuidadosamente ambos datos.</w:t>
+      </w:r>
+    </w:p>
+    <w:p>
+      <w:pPr>
+        <w:numPr>
+          <w:ilvl w:val="1"/>
+          <w:numId w:val="1029"/>
+        </w:numPr>
+      </w:pPr>
+      <w:r>
+        <w:rPr>
+          <w:b/>
+          <w:bCs/>
+        </w:rPr>
+        <w:t xml:space="preserve">Incorrecto.</w:t>
+      </w:r>
+      <w:r>
+        <w:t xml:space="preserve"> </w:t>
+      </w:r>
+      <w:r>
         <w:t xml:space="preserve">Identifica correctamente el día con mayor número de ventas, pero no selecciona los 2 sabores más preferidos según la tabla de encuesta.</w:t>
-      </w:r>
-    </w:p>
-    <w:p>
-      <w:pPr>
-        <w:numPr>
-          <w:ilvl w:val="1"/>
-          <w:numId w:val="1029"/>
-        </w:numPr>
-      </w:pPr>
-      <w:r>
-        <w:rPr>
-          <w:b/>
-          <w:bCs/>
-        </w:rPr>
-        <w:t xml:space="preserve">Incorrecto.</w:t>
-      </w:r>
-      <w:r>
-        <w:t xml:space="preserve"> </w:t>
-      </w:r>
-      <w:r>
-        <w:t xml:space="preserve">No identifica correctamente ni el día con mayor número de ventas ni los 2 sabores más preferidos. Revisa cuidadosamente ambos datos.</w:t>
-      </w:r>
-    </w:p>
-    <w:p>
-      <w:pPr>
-        <w:numPr>
-          <w:ilvl w:val="1"/>
-          <w:numId w:val="1029"/>
-        </w:numPr>
-      </w:pPr>
-      <w:r>
-        <w:rPr>
-          <w:b/>
-          <w:bCs/>
-        </w:rPr>
-        <w:t xml:space="preserve">Correcto.</w:t>
-      </w:r>
-      <w:r>
-        <w:t xml:space="preserve"> </w:t>
-      </w:r>
-      <w:r>
-        <w:t xml:space="preserve">Identifica correctamente tanto el día con mayor número de ventas como los 2 sabores más preferidos según los datos presentados.</w:t>
-      </w:r>
-    </w:p>
-    <w:p>
-      <w:pPr>
-        <w:numPr>
-          <w:ilvl w:val="1"/>
-          <w:numId w:val="1029"/>
-        </w:numPr>
-      </w:pPr>
-      <w:r>
-        <w:rPr>
-          <w:b/>
-          <w:bCs/>
-        </w:rPr>
-        <w:t xml:space="preserve">Incorrecto.</w:t>
-      </w:r>
-      <w:r>
-        <w:t xml:space="preserve"> </w:t>
-      </w:r>
-      <w:r>
-        <w:t xml:space="preserve">Identifica correctamente los 2 sabores más preferidos, pero no selecciona el día con mayor número de ventas según el gráfico.</w:t>
       </w:r>
     </w:p>
     <w:p>
@@ -3615,7 +3615,7 @@
       <w:r>
         <w:drawing>
           <wp:inline>
-            <wp:extent cx="2879999" cy="1041230"/>
+            <wp:extent cx="2879999" cy="1032369"/>
             <wp:effectExtent b="0" l="0" r="0" t="0"/>
             <wp:docPr descr="image" title="" id="63" name="Picture"/>
             <a:graphic>
@@ -3636,7 +3636,7 @@
                   <pic:spPr bwMode="auto">
                     <a:xfrm>
                       <a:off x="0" y="0"/>
-                      <a:ext cx="2879999" cy="1041230"/>
+                      <a:ext cx="2879999" cy="1032369"/>
                     </a:xfrm>
                     <a:prstGeom prst="rect">
                       <a:avLst/>
@@ -3750,7 +3750,7 @@
         </w:numPr>
       </w:pPr>
       <w:r>
-        <w:t xml:space="preserve">La promoción será el domingo con tortas de canela y café.</w:t>
+        <w:t xml:space="preserve">Se venderán el viernes y los sabores serán durazno y mora.</w:t>
       </w:r>
     </w:p>
     <w:p>
@@ -3761,7 +3761,7 @@
         </w:numPr>
       </w:pPr>
       <w:r>
-        <w:t xml:space="preserve">El día lunes se ofrecerán sabores caramelo y café.</w:t>
+        <w:t xml:space="preserve">El día martes se ofrecerán sabores mora y manzana.</w:t>
       </w:r>
     </w:p>
     <w:p>
@@ -3772,7 +3772,7 @@
         </w:numPr>
       </w:pPr>
       <w:r>
-        <w:t xml:space="preserve">Se venderán el domingo y los sabores serán miel y canela.</w:t>
+        <w:t xml:space="preserve">El día lunes se ofrecerán sabores mora y manzana.</w:t>
       </w:r>
     </w:p>
     <w:p>
@@ -3783,7 +3783,7 @@
         </w:numPr>
       </w:pPr>
       <w:r>
-        <w:t xml:space="preserve">La promoción será el domingo con tortas de caramelo y café.</w:t>
+        <w:t xml:space="preserve">Se venderán el miércoles y los sabores serán mora y manzana.</w:t>
       </w:r>
     </w:p>
     <w:p>
@@ -3872,7 +3872,7 @@
         </w:numPr>
       </w:pPr>
       <w:r>
-        <w:t xml:space="preserve">Caramelo : 194 clientes</w:t>
+        <w:t xml:space="preserve">Mora : 189 clientes</w:t>
       </w:r>
     </w:p>
     <w:p>
@@ -3883,7 +3883,7 @@
         </w:numPr>
       </w:pPr>
       <w:r>
-        <w:t xml:space="preserve">Café : 193 clientes</w:t>
+        <w:t xml:space="preserve">Manzana : 176 clientes</w:t>
       </w:r>
     </w:p>
     <w:p>
@@ -3894,7 +3894,7 @@
         </w:numPr>
       </w:pPr>
       <w:r>
-        <w:t xml:space="preserve">Miel : 174 clientes</w:t>
+        <w:t xml:space="preserve">Durazno : 123 clientes</w:t>
       </w:r>
     </w:p>
     <w:p>
@@ -3905,7 +3905,7 @@
         </w:numPr>
       </w:pPr>
       <w:r>
-        <w:t xml:space="preserve">Canela : 165 clientes</w:t>
+        <w:t xml:space="preserve">Maracuyá : 122 clientes</w:t>
       </w:r>
     </w:p>
     <w:p>
@@ -3926,7 +3926,7 @@
           <w:b/>
           <w:bCs/>
         </w:rPr>
-        <w:t xml:space="preserve">Caramelo</w:t>
+        <w:t xml:space="preserve">Mora</w:t>
       </w:r>
       <w:r>
         <w:t xml:space="preserve"> </w:t>
@@ -3942,7 +3942,7 @@
           <w:b/>
           <w:bCs/>
         </w:rPr>
-        <w:t xml:space="preserve">Café</w:t>
+        <w:t xml:space="preserve">Manzana</w:t>
       </w:r>
       <w:r>
         <w:t xml:space="preserve">.</w:t>
@@ -3971,7 +3971,7 @@
         </w:numPr>
       </w:pPr>
       <w:r>
-        <w:t xml:space="preserve">El día con mayor número de ventas es: ** Domingo ** con 48 tortas vendidas.</w:t>
+        <w:t xml:space="preserve">El día con mayor número de ventas es: ** Martes ** con 59 tortas vendidas.</w:t>
       </w:r>
     </w:p>
     <w:p>
@@ -3992,7 +3992,7 @@
         <w:t xml:space="preserve"> </w:t>
       </w:r>
       <w:r>
-        <w:t xml:space="preserve">Se venderán el domingo y los sabores serán caramelo y café.</w:t>
+        <w:t xml:space="preserve">Se venderán el martes y los sabores serán mora y manzana.</w:t>
       </w:r>
     </w:p>
     <w:p>
@@ -4013,6 +4013,48 @@
         <w:t xml:space="preserve"> </w:t>
       </w:r>
       <w:r>
+        <w:t xml:space="preserve">No identifica correctamente ni el día con mayor número de ventas ni los 2 sabores más preferidos. Revisa cuidadosamente ambos datos.</w:t>
+      </w:r>
+    </w:p>
+    <w:p>
+      <w:pPr>
+        <w:numPr>
+          <w:ilvl w:val="1"/>
+          <w:numId w:val="1033"/>
+        </w:numPr>
+      </w:pPr>
+      <w:r>
+        <w:rPr>
+          <w:b/>
+          <w:bCs/>
+        </w:rPr>
+        <w:t xml:space="preserve">Correcto.</w:t>
+      </w:r>
+      <w:r>
+        <w:t xml:space="preserve"> </w:t>
+      </w:r>
+      <w:r>
+        <w:t xml:space="preserve">Identifica correctamente tanto el día con mayor número de ventas como los 2 sabores más preferidos según los datos presentados.</w:t>
+      </w:r>
+    </w:p>
+    <w:p>
+      <w:pPr>
+        <w:numPr>
+          <w:ilvl w:val="1"/>
+          <w:numId w:val="1033"/>
+        </w:numPr>
+      </w:pPr>
+      <w:r>
+        <w:rPr>
+          <w:b/>
+          <w:bCs/>
+        </w:rPr>
+        <w:t xml:space="preserve">Incorrecto.</w:t>
+      </w:r>
+      <w:r>
+        <w:t xml:space="preserve"> </w:t>
+      </w:r>
+      <w:r>
         <w:t xml:space="preserve">Identifica correctamente los 2 sabores más preferidos, pero no selecciona el día con mayor número de ventas según el gráfico.</w:t>
       </w:r>
     </w:p>
@@ -4034,49 +4076,7 @@
         <w:t xml:space="preserve"> </w:t>
       </w:r>
       <w:r>
-        <w:t xml:space="preserve">No identifica correctamente ni el día con mayor número de ventas ni los 2 sabores más preferidos. Revisa cuidadosamente ambos datos.</w:t>
-      </w:r>
-    </w:p>
-    <w:p>
-      <w:pPr>
-        <w:numPr>
-          <w:ilvl w:val="1"/>
-          <w:numId w:val="1033"/>
-        </w:numPr>
-      </w:pPr>
-      <w:r>
-        <w:rPr>
-          <w:b/>
-          <w:bCs/>
-        </w:rPr>
-        <w:t xml:space="preserve">Incorrecto.</w:t>
-      </w:r>
-      <w:r>
-        <w:t xml:space="preserve"> </w:t>
-      </w:r>
-      <w:r>
         <w:t xml:space="preserve">Identifica correctamente el día con mayor número de ventas, pero no selecciona los 2 sabores más preferidos según la tabla de encuesta.</w:t>
-      </w:r>
-    </w:p>
-    <w:p>
-      <w:pPr>
-        <w:numPr>
-          <w:ilvl w:val="1"/>
-          <w:numId w:val="1033"/>
-        </w:numPr>
-      </w:pPr>
-      <w:r>
-        <w:rPr>
-          <w:b/>
-          <w:bCs/>
-        </w:rPr>
-        <w:t xml:space="preserve">Correcto.</w:t>
-      </w:r>
-      <w:r>
-        <w:t xml:space="preserve"> </w:t>
-      </w:r>
-      <w:r>
-        <w:t xml:space="preserve">Identifica correctamente tanto el día con mayor número de ventas como los 2 sabores más preferidos según los datos presentados.</w:t>
       </w:r>
     </w:p>
     <w:p>
@@ -4110,7 +4110,7 @@
       <w:r>
         <w:drawing>
           <wp:inline>
-            <wp:extent cx="2879999" cy="1112123"/>
+            <wp:extent cx="2879999" cy="1032369"/>
             <wp:effectExtent b="0" l="0" r="0" t="0"/>
             <wp:docPr descr="image" title="" id="69" name="Picture"/>
             <a:graphic>
@@ -4131,7 +4131,7 @@
                   <pic:spPr bwMode="auto">
                     <a:xfrm>
                       <a:off x="0" y="0"/>
-                      <a:ext cx="2879999" cy="1112123"/>
+                      <a:ext cx="2879999" cy="1032369"/>
                     </a:xfrm>
                     <a:prstGeom prst="rect">
                       <a:avLst/>
@@ -4245,7 +4245,7 @@
         </w:numPr>
       </w:pPr>
       <w:r>
-        <w:t xml:space="preserve">La promoción será el lunes con tortas de coco y limón.</w:t>
+        <w:t xml:space="preserve">La promoción será el miércoles con tortas de mora y durazno.</w:t>
       </w:r>
     </w:p>
     <w:p>
@@ -4256,7 +4256,7 @@
         </w:numPr>
       </w:pPr>
       <w:r>
-        <w:t xml:space="preserve">Se venderán el lunes y los sabores serán vainilla y coco.</w:t>
+        <w:t xml:space="preserve">Se venderán el miércoles y los sabores serán manzana y mora.</w:t>
       </w:r>
     </w:p>
     <w:p>
@@ -4267,7 +4267,7 @@
         </w:numPr>
       </w:pPr>
       <w:r>
-        <w:t xml:space="preserve">El día lunes se ofrecerán sabores fresa y limón.</w:t>
+        <w:t xml:space="preserve">Se venderán el sábado y los sabores serán maracuyá y durazno.</w:t>
       </w:r>
     </w:p>
     <w:p>
@@ -4278,7 +4278,7 @@
         </w:numPr>
       </w:pPr>
       <w:r>
-        <w:t xml:space="preserve">Se venderán el miércoles y los sabores serán fresa y limón.</w:t>
+        <w:t xml:space="preserve">La promoción será el miércoles con tortas de maracuyá y durazno.</w:t>
       </w:r>
     </w:p>
     <w:p>
@@ -4367,7 +4367,7 @@
         </w:numPr>
       </w:pPr>
       <w:r>
-        <w:t xml:space="preserve">Fresa : 189 clientes</w:t>
+        <w:t xml:space="preserve">Maracuyá : 190 clientes</w:t>
       </w:r>
     </w:p>
     <w:p>
@@ -4378,7 +4378,7 @@
         </w:numPr>
       </w:pPr>
       <w:r>
-        <w:t xml:space="preserve">Limón : 179 clientes</w:t>
+        <w:t xml:space="preserve">Durazno : 175 clientes</w:t>
       </w:r>
     </w:p>
     <w:p>
@@ -4389,7 +4389,7 @@
         </w:numPr>
       </w:pPr>
       <w:r>
-        <w:t xml:space="preserve">Vainilla : 164 clientes</w:t>
+        <w:t xml:space="preserve">Manzana : 170 clientes</w:t>
       </w:r>
     </w:p>
     <w:p>
@@ -4400,7 +4400,7 @@
         </w:numPr>
       </w:pPr>
       <w:r>
-        <w:t xml:space="preserve">Coco : 148 clientes</w:t>
+        <w:t xml:space="preserve">Mora : 144 clientes</w:t>
       </w:r>
     </w:p>
     <w:p>
@@ -4421,7 +4421,7 @@
           <w:b/>
           <w:bCs/>
         </w:rPr>
-        <w:t xml:space="preserve">Fresa</w:t>
+        <w:t xml:space="preserve">Maracuyá</w:t>
       </w:r>
       <w:r>
         <w:t xml:space="preserve"> </w:t>
@@ -4437,7 +4437,7 @@
           <w:b/>
           <w:bCs/>
         </w:rPr>
-        <w:t xml:space="preserve">Limón</w:t>
+        <w:t xml:space="preserve">Durazno</w:t>
       </w:r>
       <w:r>
         <w:t xml:space="preserve">.</w:t>
@@ -4466,7 +4466,7 @@
         </w:numPr>
       </w:pPr>
       <w:r>
-        <w:t xml:space="preserve">El día con mayor número de ventas es: ** Lunes ** con 42 tortas vendidas.</w:t>
+        <w:t xml:space="preserve">El día con mayor número de ventas es: ** Miércoles ** con 53 tortas vendidas.</w:t>
       </w:r>
     </w:p>
     <w:p>
@@ -4487,7 +4487,7 @@
         <w:t xml:space="preserve"> </w:t>
       </w:r>
       <w:r>
-        <w:t xml:space="preserve">Se venderán el lunes y los sabores serán fresa y limón.</w:t>
+        <w:t xml:space="preserve">Se venderán el miércoles y los sabores serán maracuyá y durazno.</w:t>
       </w:r>
     </w:p>
     <w:p>
@@ -4544,6 +4544,27 @@
           <w:b/>
           <w:bCs/>
         </w:rPr>
+        <w:t xml:space="preserve">Incorrecto.</w:t>
+      </w:r>
+      <w:r>
+        <w:t xml:space="preserve"> </w:t>
+      </w:r>
+      <w:r>
+        <w:t xml:space="preserve">No identifica correctamente ni el día con mayor número de ventas ni los 2 sabores más preferidos. Revisa cuidadosamente ambos datos.</w:t>
+      </w:r>
+    </w:p>
+    <w:p>
+      <w:pPr>
+        <w:numPr>
+          <w:ilvl w:val="1"/>
+          <w:numId w:val="1037"/>
+        </w:numPr>
+      </w:pPr>
+      <w:r>
+        <w:rPr>
+          <w:b/>
+          <w:bCs/>
+        </w:rPr>
         <w:t xml:space="preserve">Correcto.</w:t>
       </w:r>
       <w:r>
@@ -4551,27 +4572,6 @@
       </w:r>
       <w:r>
         <w:t xml:space="preserve">Identifica correctamente tanto el día con mayor número de ventas como los 2 sabores más preferidos según los datos presentados.</w:t>
-      </w:r>
-    </w:p>
-    <w:p>
-      <w:pPr>
-        <w:numPr>
-          <w:ilvl w:val="1"/>
-          <w:numId w:val="1037"/>
-        </w:numPr>
-      </w:pPr>
-      <w:r>
-        <w:rPr>
-          <w:b/>
-          <w:bCs/>
-        </w:rPr>
-        <w:t xml:space="preserve">Incorrecto.</w:t>
-      </w:r>
-      <w:r>
-        <w:t xml:space="preserve"> </w:t>
-      </w:r>
-      <w:r>
-        <w:t xml:space="preserve">No identifica correctamente ni el día con mayor número de ventas ni los 2 sabores más preferidos. Revisa cuidadosamente ambos datos.</w:t>
       </w:r>
     </w:p>
     <w:p>
@@ -4605,7 +4605,7 @@
       <w:r>
         <w:drawing>
           <wp:inline>
-            <wp:extent cx="2879999" cy="1041230"/>
+            <wp:extent cx="2879999" cy="1032369"/>
             <wp:effectExtent b="0" l="0" r="0" t="0"/>
             <wp:docPr descr="image" title="" id="75" name="Picture"/>
             <a:graphic>
@@ -4626,7 +4626,7 @@
                   <pic:spPr bwMode="auto">
                     <a:xfrm>
                       <a:off x="0" y="0"/>
-                      <a:ext cx="2879999" cy="1041230"/>
+                      <a:ext cx="2879999" cy="1032369"/>
                     </a:xfrm>
                     <a:prstGeom prst="rect">
                       <a:avLst/>
@@ -4740,7 +4740,7 @@
         </w:numPr>
       </w:pPr>
       <w:r>
-        <w:t xml:space="preserve">La promoción será el jueves con tortas de miel y café.</w:t>
+        <w:t xml:space="preserve">Se venderán el jueves y los sabores serán durazno y maracuyá.</w:t>
       </w:r>
     </w:p>
     <w:p>
@@ -4751,7 +4751,7 @@
         </w:numPr>
       </w:pPr>
       <w:r>
-        <w:t xml:space="preserve">Se venderán el viernes y los sabores serán canela y café.</w:t>
+        <w:t xml:space="preserve">La promoción será el jueves con tortas de maracuyá y mora.</w:t>
       </w:r>
     </w:p>
     <w:p>
@@ -4762,7 +4762,7 @@
         </w:numPr>
       </w:pPr>
       <w:r>
-        <w:t xml:space="preserve">Se venderán el jueves y los sabores serán caramelo y miel.</w:t>
+        <w:t xml:space="preserve">El día jueves se ofrecerán sabores manzana y mora.</w:t>
       </w:r>
     </w:p>
     <w:p>
@@ -4773,7 +4773,7 @@
         </w:numPr>
       </w:pPr>
       <w:r>
-        <w:t xml:space="preserve">El día jueves se ofrecerán sabores canela y café.</w:t>
+        <w:t xml:space="preserve">Se venderán el sábado y los sabores serán manzana y mora.</w:t>
       </w:r>
     </w:p>
     <w:p>
@@ -4862,7 +4862,7 @@
         </w:numPr>
       </w:pPr>
       <w:r>
-        <w:t xml:space="preserve">Canela : 182 clientes</w:t>
+        <w:t xml:space="preserve">Manzana : 198 clientes</w:t>
       </w:r>
     </w:p>
     <w:p>
@@ -4873,7 +4873,7 @@
         </w:numPr>
       </w:pPr>
       <w:r>
-        <w:t xml:space="preserve">Café : 179 clientes</w:t>
+        <w:t xml:space="preserve">Mora : 197 clientes</w:t>
       </w:r>
     </w:p>
     <w:p>
@@ -4884,7 +4884,7 @@
         </w:numPr>
       </w:pPr>
       <w:r>
-        <w:t xml:space="preserve">Miel : 176 clientes</w:t>
+        <w:t xml:space="preserve">Durazno : 196 clientes</w:t>
       </w:r>
     </w:p>
     <w:p>
@@ -4895,7 +4895,7 @@
         </w:numPr>
       </w:pPr>
       <w:r>
-        <w:t xml:space="preserve">Caramelo : 131 clientes</w:t>
+        <w:t xml:space="preserve">Maracuyá : 152 clientes</w:t>
       </w:r>
     </w:p>
     <w:p>
@@ -4916,7 +4916,7 @@
           <w:b/>
           <w:bCs/>
         </w:rPr>
-        <w:t xml:space="preserve">Canela</w:t>
+        <w:t xml:space="preserve">Manzana</w:t>
       </w:r>
       <w:r>
         <w:t xml:space="preserve"> </w:t>
@@ -4932,7 +4932,7 @@
           <w:b/>
           <w:bCs/>
         </w:rPr>
-        <w:t xml:space="preserve">Café</w:t>
+        <w:t xml:space="preserve">Mora</w:t>
       </w:r>
       <w:r>
         <w:t xml:space="preserve">.</w:t>
@@ -4961,7 +4961,7 @@
         </w:numPr>
       </w:pPr>
       <w:r>
-        <w:t xml:space="preserve">El día con mayor número de ventas es: ** Jueves ** con 47 tortas vendidas.</w:t>
+        <w:t xml:space="preserve">El día con mayor número de ventas es: ** Jueves ** con 58 tortas vendidas.</w:t>
       </w:r>
     </w:p>
     <w:p>
@@ -4982,7 +4982,7 @@
         <w:t xml:space="preserve"> </w:t>
       </w:r>
       <w:r>
-        <w:t xml:space="preserve">Se venderán el jueves y los sabores serán canela y café.</w:t>
+        <w:t xml:space="preserve">Se venderán el jueves y los sabores serán manzana y mora.</w:t>
       </w:r>
     </w:p>
     <w:p>
@@ -5003,6 +5003,27 @@
         <w:t xml:space="preserve"> </w:t>
       </w:r>
       <w:r>
+        <w:t xml:space="preserve">Identifica correctamente el día con mayor número de ventas, pero no selecciona los 2 sabores más preferidos según la tabla de encuesta.</w:t>
+      </w:r>
+    </w:p>
+    <w:p>
+      <w:pPr>
+        <w:numPr>
+          <w:ilvl w:val="1"/>
+          <w:numId w:val="1041"/>
+        </w:numPr>
+      </w:pPr>
+      <w:r>
+        <w:rPr>
+          <w:b/>
+          <w:bCs/>
+        </w:rPr>
+        <w:t xml:space="preserve">Incorrecto.</w:t>
+      </w:r>
+      <w:r>
+        <w:t xml:space="preserve"> </w:t>
+      </w:r>
+      <w:r>
         <w:t xml:space="preserve">Identifica correctamente los 2 sabores más preferidos, pero no selecciona el día con mayor número de ventas según el gráfico.</w:t>
       </w:r>
     </w:p>
@@ -5018,6 +5039,27 @@
           <w:b/>
           <w:bCs/>
         </w:rPr>
+        <w:t xml:space="preserve">Correcto.</w:t>
+      </w:r>
+      <w:r>
+        <w:t xml:space="preserve"> </w:t>
+      </w:r>
+      <w:r>
+        <w:t xml:space="preserve">Identifica correctamente tanto el día con mayor número de ventas como los 2 sabores más preferidos según los datos presentados.</w:t>
+      </w:r>
+    </w:p>
+    <w:p>
+      <w:pPr>
+        <w:numPr>
+          <w:ilvl w:val="1"/>
+          <w:numId w:val="1041"/>
+        </w:numPr>
+      </w:pPr>
+      <w:r>
+        <w:rPr>
+          <w:b/>
+          <w:bCs/>
+        </w:rPr>
         <w:t xml:space="preserve">Incorrecto.</w:t>
       </w:r>
       <w:r>
@@ -5025,48 +5067,6 @@
       </w:r>
       <w:r>
         <w:t xml:space="preserve">No identifica correctamente ni el día con mayor número de ventas ni los 2 sabores más preferidos. Revisa cuidadosamente ambos datos.</w:t>
-      </w:r>
-    </w:p>
-    <w:p>
-      <w:pPr>
-        <w:numPr>
-          <w:ilvl w:val="1"/>
-          <w:numId w:val="1041"/>
-        </w:numPr>
-      </w:pPr>
-      <w:r>
-        <w:rPr>
-          <w:b/>
-          <w:bCs/>
-        </w:rPr>
-        <w:t xml:space="preserve">Incorrecto.</w:t>
-      </w:r>
-      <w:r>
-        <w:t xml:space="preserve"> </w:t>
-      </w:r>
-      <w:r>
-        <w:t xml:space="preserve">Identifica correctamente el día con mayor número de ventas, pero no selecciona los 2 sabores más preferidos según la tabla de encuesta.</w:t>
-      </w:r>
-    </w:p>
-    <w:p>
-      <w:pPr>
-        <w:numPr>
-          <w:ilvl w:val="1"/>
-          <w:numId w:val="1041"/>
-        </w:numPr>
-      </w:pPr>
-      <w:r>
-        <w:rPr>
-          <w:b/>
-          <w:bCs/>
-        </w:rPr>
-        <w:t xml:space="preserve">Correcto.</w:t>
-      </w:r>
-      <w:r>
-        <w:t xml:space="preserve"> </w:t>
-      </w:r>
-      <w:r>
-        <w:t xml:space="preserve">Identifica correctamente tanto el día con mayor número de ventas como los 2 sabores más preferidos según los datos presentados.</w:t>
       </w:r>
     </w:p>
     <w:bookmarkEnd w:id="80"/>

</xml_diff>